<commit_message>
CAR Varones: caratulas con el escudo completo del logo oficial del Gobierno Regional San Martin
Co-Authored-By: Claude Opus 5.5 <noreply@anthropic.com>
Claude-Session: https://claude.ai/code/session_0142t8T16igb3VKxUPwnQPq6
</commit_message>
<xml_diff>
--- a/entregables_varones/CARATULAS_DRENAJE_PLUVIAL_CAR_VARONES.docx
+++ b/entregables_varones/CARATULAS_DRENAJE_PLUVIAL_CAR_VARONES.docx
@@ -23,13 +23,13 @@
         <w:tblLook w:firstColumn="1" w:firstRow="1" w:lastColumn="0" w:lastRow="0" w:noHBand="0" w:noVBand="1" w:val="04A0"/>
       </w:tblPr>
       <w:tblGrid>
-        <w:gridCol w:w="1474"/>
-        <w:gridCol w:w="8164"/>
+        <w:gridCol w:w="1814"/>
+        <w:gridCol w:w="7824"/>
       </w:tblGrid>
       <w:tr>
         <w:tc>
           <w:tcPr>
-            <w:tcW w:type="dxa" w:w="1474"/>
+            <w:tcW w:type="dxa" w:w="1814"/>
             <w:vAlign w:val="center"/>
           </w:tcPr>
           <w:p>
@@ -40,7 +40,7 @@
             <w:r>
               <w:drawing>
                 <wp:inline xmlns:a="http://schemas.openxmlformats.org/drawingml/2006/main" xmlns:pic="http://schemas.openxmlformats.org/drawingml/2006/picture">
-                  <wp:extent cx="792000" cy="836830"/>
+                  <wp:extent cx="905890" cy="1007999"/>
                   <wp:docPr id="1" name="Picture 1"/>
                   <wp:cNvGraphicFramePr>
                     <a:graphicFrameLocks noChangeAspect="1"/>
@@ -61,7 +61,7 @@
                         <pic:spPr>
                           <a:xfrm>
                             <a:off x="0" y="0"/>
-                            <a:ext cx="792000" cy="836830"/>
+                            <a:ext cx="905890" cy="1007999"/>
                           </a:xfrm>
                           <a:prstGeom prst="rect"/>
                         </pic:spPr>
@@ -75,7 +75,7 @@
         </w:tc>
         <w:tc>
           <w:tcPr>
-            <w:tcW w:type="dxa" w:w="8164"/>
+            <w:tcW w:type="dxa" w:w="7824"/>
             <w:vAlign w:val="center"/>
           </w:tcPr>
           <w:p>
@@ -519,13 +519,13 @@
         <w:tblLook w:firstColumn="1" w:firstRow="1" w:lastColumn="0" w:lastRow="0" w:noHBand="0" w:noVBand="1" w:val="04A0"/>
       </w:tblPr>
       <w:tblGrid>
-        <w:gridCol w:w="1474"/>
-        <w:gridCol w:w="8164"/>
+        <w:gridCol w:w="1814"/>
+        <w:gridCol w:w="7824"/>
       </w:tblGrid>
       <w:tr>
         <w:tc>
           <w:tcPr>
-            <w:tcW w:type="dxa" w:w="1474"/>
+            <w:tcW w:type="dxa" w:w="1814"/>
             <w:vAlign w:val="center"/>
           </w:tcPr>
           <w:p>
@@ -536,7 +536,7 @@
             <w:r>
               <w:drawing>
                 <wp:inline xmlns:a="http://schemas.openxmlformats.org/drawingml/2006/main" xmlns:pic="http://schemas.openxmlformats.org/drawingml/2006/picture">
-                  <wp:extent cx="792000" cy="836830"/>
+                  <wp:extent cx="905890" cy="1007999"/>
                   <wp:docPr id="3" name="Picture 3"/>
                   <wp:cNvGraphicFramePr>
                     <a:graphicFrameLocks noChangeAspect="1"/>
@@ -557,7 +557,7 @@
                         <pic:spPr>
                           <a:xfrm>
                             <a:off x="0" y="0"/>
-                            <a:ext cx="792000" cy="836830"/>
+                            <a:ext cx="905890" cy="1007999"/>
                           </a:xfrm>
                           <a:prstGeom prst="rect"/>
                         </pic:spPr>
@@ -571,7 +571,7 @@
         </w:tc>
         <w:tc>
           <w:tcPr>
-            <w:tcW w:type="dxa" w:w="8164"/>
+            <w:tcW w:type="dxa" w:w="7824"/>
             <w:vAlign w:val="center"/>
           </w:tcPr>
           <w:p>
@@ -1032,13 +1032,13 @@
         <w:tblLook w:firstColumn="1" w:firstRow="1" w:lastColumn="0" w:lastRow="0" w:noHBand="0" w:noVBand="1" w:val="04A0"/>
       </w:tblPr>
       <w:tblGrid>
-        <w:gridCol w:w="1474"/>
-        <w:gridCol w:w="8164"/>
+        <w:gridCol w:w="1814"/>
+        <w:gridCol w:w="7824"/>
       </w:tblGrid>
       <w:tr>
         <w:tc>
           <w:tcPr>
-            <w:tcW w:type="dxa" w:w="1474"/>
+            <w:tcW w:type="dxa" w:w="1814"/>
             <w:vAlign w:val="center"/>
           </w:tcPr>
           <w:p>
@@ -1049,7 +1049,7 @@
             <w:r>
               <w:drawing>
                 <wp:inline xmlns:a="http://schemas.openxmlformats.org/drawingml/2006/main" xmlns:pic="http://schemas.openxmlformats.org/drawingml/2006/picture">
-                  <wp:extent cx="792000" cy="836830"/>
+                  <wp:extent cx="905890" cy="1007999"/>
                   <wp:docPr id="5" name="Picture 5"/>
                   <wp:cNvGraphicFramePr>
                     <a:graphicFrameLocks noChangeAspect="1"/>
@@ -1070,7 +1070,7 @@
                         <pic:spPr>
                           <a:xfrm>
                             <a:off x="0" y="0"/>
-                            <a:ext cx="792000" cy="836830"/>
+                            <a:ext cx="905890" cy="1007999"/>
                           </a:xfrm>
                           <a:prstGeom prst="rect"/>
                         </pic:spPr>
@@ -1084,7 +1084,7 @@
         </w:tc>
         <w:tc>
           <w:tcPr>
-            <w:tcW w:type="dxa" w:w="8164"/>
+            <w:tcW w:type="dxa" w:w="7824"/>
             <w:vAlign w:val="center"/>
           </w:tcPr>
           <w:p>
@@ -1545,13 +1545,13 @@
         <w:tblLook w:firstColumn="1" w:firstRow="1" w:lastColumn="0" w:lastRow="0" w:noHBand="0" w:noVBand="1" w:val="04A0"/>
       </w:tblPr>
       <w:tblGrid>
-        <w:gridCol w:w="1474"/>
-        <w:gridCol w:w="8164"/>
+        <w:gridCol w:w="1814"/>
+        <w:gridCol w:w="7824"/>
       </w:tblGrid>
       <w:tr>
         <w:tc>
           <w:tcPr>
-            <w:tcW w:type="dxa" w:w="1474"/>
+            <w:tcW w:type="dxa" w:w="1814"/>
             <w:vAlign w:val="center"/>
           </w:tcPr>
           <w:p>
@@ -1562,7 +1562,7 @@
             <w:r>
               <w:drawing>
                 <wp:inline xmlns:a="http://schemas.openxmlformats.org/drawingml/2006/main" xmlns:pic="http://schemas.openxmlformats.org/drawingml/2006/picture">
-                  <wp:extent cx="792000" cy="836830"/>
+                  <wp:extent cx="905890" cy="1007999"/>
                   <wp:docPr id="7" name="Picture 7"/>
                   <wp:cNvGraphicFramePr>
                     <a:graphicFrameLocks noChangeAspect="1"/>
@@ -1583,7 +1583,7 @@
                         <pic:spPr>
                           <a:xfrm>
                             <a:off x="0" y="0"/>
-                            <a:ext cx="792000" cy="836830"/>
+                            <a:ext cx="905890" cy="1007999"/>
                           </a:xfrm>
                           <a:prstGeom prst="rect"/>
                         </pic:spPr>
@@ -1597,7 +1597,7 @@
         </w:tc>
         <w:tc>
           <w:tcPr>
-            <w:tcW w:type="dxa" w:w="8164"/>
+            <w:tcW w:type="dxa" w:w="7824"/>
             <w:vAlign w:val="center"/>
           </w:tcPr>
           <w:p>
@@ -2041,13 +2041,13 @@
         <w:tblLook w:firstColumn="1" w:firstRow="1" w:lastColumn="0" w:lastRow="0" w:noHBand="0" w:noVBand="1" w:val="04A0"/>
       </w:tblPr>
       <w:tblGrid>
-        <w:gridCol w:w="1474"/>
-        <w:gridCol w:w="8164"/>
+        <w:gridCol w:w="1814"/>
+        <w:gridCol w:w="7824"/>
       </w:tblGrid>
       <w:tr>
         <w:tc>
           <w:tcPr>
-            <w:tcW w:type="dxa" w:w="1474"/>
+            <w:tcW w:type="dxa" w:w="1814"/>
             <w:vAlign w:val="center"/>
           </w:tcPr>
           <w:p>
@@ -2058,7 +2058,7 @@
             <w:r>
               <w:drawing>
                 <wp:inline xmlns:a="http://schemas.openxmlformats.org/drawingml/2006/main" xmlns:pic="http://schemas.openxmlformats.org/drawingml/2006/picture">
-                  <wp:extent cx="792000" cy="836830"/>
+                  <wp:extent cx="905890" cy="1007999"/>
                   <wp:docPr id="9" name="Picture 9"/>
                   <wp:cNvGraphicFramePr>
                     <a:graphicFrameLocks noChangeAspect="1"/>
@@ -2079,7 +2079,7 @@
                         <pic:spPr>
                           <a:xfrm>
                             <a:off x="0" y="0"/>
-                            <a:ext cx="792000" cy="836830"/>
+                            <a:ext cx="905890" cy="1007999"/>
                           </a:xfrm>
                           <a:prstGeom prst="rect"/>
                         </pic:spPr>
@@ -2093,7 +2093,7 @@
         </w:tc>
         <w:tc>
           <w:tcPr>
-            <w:tcW w:type="dxa" w:w="8164"/>
+            <w:tcW w:type="dxa" w:w="7824"/>
             <w:vAlign w:val="center"/>
           </w:tcPr>
           <w:p>
@@ -2554,13 +2554,13 @@
         <w:tblLook w:firstColumn="1" w:firstRow="1" w:lastColumn="0" w:lastRow="0" w:noHBand="0" w:noVBand="1" w:val="04A0"/>
       </w:tblPr>
       <w:tblGrid>
-        <w:gridCol w:w="1474"/>
-        <w:gridCol w:w="8164"/>
+        <w:gridCol w:w="1814"/>
+        <w:gridCol w:w="7824"/>
       </w:tblGrid>
       <w:tr>
         <w:tc>
           <w:tcPr>
-            <w:tcW w:type="dxa" w:w="1474"/>
+            <w:tcW w:type="dxa" w:w="1814"/>
             <w:vAlign w:val="center"/>
           </w:tcPr>
           <w:p>
@@ -2571,7 +2571,7 @@
             <w:r>
               <w:drawing>
                 <wp:inline xmlns:a="http://schemas.openxmlformats.org/drawingml/2006/main" xmlns:pic="http://schemas.openxmlformats.org/drawingml/2006/picture">
-                  <wp:extent cx="792000" cy="836830"/>
+                  <wp:extent cx="905890" cy="1007999"/>
                   <wp:docPr id="11" name="Picture 11"/>
                   <wp:cNvGraphicFramePr>
                     <a:graphicFrameLocks noChangeAspect="1"/>
@@ -2592,7 +2592,7 @@
                         <pic:spPr>
                           <a:xfrm>
                             <a:off x="0" y="0"/>
-                            <a:ext cx="792000" cy="836830"/>
+                            <a:ext cx="905890" cy="1007999"/>
                           </a:xfrm>
                           <a:prstGeom prst="rect"/>
                         </pic:spPr>
@@ -2606,7 +2606,7 @@
         </w:tc>
         <w:tc>
           <w:tcPr>
-            <w:tcW w:type="dxa" w:w="8164"/>
+            <w:tcW w:type="dxa" w:w="7824"/>
             <w:vAlign w:val="center"/>
           </w:tcPr>
           <w:p>
@@ -3050,13 +3050,13 @@
         <w:tblLook w:firstColumn="1" w:firstRow="1" w:lastColumn="0" w:lastRow="0" w:noHBand="0" w:noVBand="1" w:val="04A0"/>
       </w:tblPr>
       <w:tblGrid>
-        <w:gridCol w:w="1474"/>
-        <w:gridCol w:w="8164"/>
+        <w:gridCol w:w="1814"/>
+        <w:gridCol w:w="7824"/>
       </w:tblGrid>
       <w:tr>
         <w:tc>
           <w:tcPr>
-            <w:tcW w:type="dxa" w:w="1474"/>
+            <w:tcW w:type="dxa" w:w="1814"/>
             <w:vAlign w:val="center"/>
           </w:tcPr>
           <w:p>
@@ -3067,7 +3067,7 @@
             <w:r>
               <w:drawing>
                 <wp:inline xmlns:a="http://schemas.openxmlformats.org/drawingml/2006/main" xmlns:pic="http://schemas.openxmlformats.org/drawingml/2006/picture">
-                  <wp:extent cx="792000" cy="836830"/>
+                  <wp:extent cx="905890" cy="1007999"/>
                   <wp:docPr id="13" name="Picture 13"/>
                   <wp:cNvGraphicFramePr>
                     <a:graphicFrameLocks noChangeAspect="1"/>
@@ -3088,7 +3088,7 @@
                         <pic:spPr>
                           <a:xfrm>
                             <a:off x="0" y="0"/>
-                            <a:ext cx="792000" cy="836830"/>
+                            <a:ext cx="905890" cy="1007999"/>
                           </a:xfrm>
                           <a:prstGeom prst="rect"/>
                         </pic:spPr>
@@ -3102,7 +3102,7 @@
         </w:tc>
         <w:tc>
           <w:tcPr>
-            <w:tcW w:type="dxa" w:w="8164"/>
+            <w:tcW w:type="dxa" w:w="7824"/>
             <w:vAlign w:val="center"/>
           </w:tcPr>
           <w:p>

</xml_diff>

<commit_message>
CAR Varones: fecha setiembre 2026 (la de los rotulos) en caratulas, memoria descriptiva y memoria de calculo del colector
Co-Authored-By: Claude Opus 5.5 <noreply@anthropic.com>
Claude-Session: https://claude.ai/code/session_0142t8T16igb3VKxUPwnQPq6
</commit_message>
<xml_diff>
--- a/entregables_varones/CARATULAS_DRENAJE_PLUVIAL_CAR_VARONES.docx
+++ b/entregables_varones/CARATULAS_DRENAJE_PLUVIAL_CAR_VARONES.docx
@@ -484,7 +484,7 @@
                 <w:color w:val="7B1E2B"/>
                 <w:spacing w:val="6"/>
               </w:rPr>
-              <w:t xml:space="preserve">   OCTUBRE - 2026</w:t>
+              <w:t xml:space="preserve">   SETIEMBRE - 2026</w:t>
             </w:r>
           </w:p>
         </w:tc>
@@ -997,7 +997,7 @@
                 <w:color w:val="7B1E2B"/>
                 <w:spacing w:val="6"/>
               </w:rPr>
-              <w:t xml:space="preserve">   OCTUBRE - 2026</w:t>
+              <w:t xml:space="preserve">   SETIEMBRE - 2026</w:t>
             </w:r>
           </w:p>
         </w:tc>
@@ -1510,7 +1510,7 @@
                 <w:color w:val="7B1E2B"/>
                 <w:spacing w:val="6"/>
               </w:rPr>
-              <w:t xml:space="preserve">   OCTUBRE - 2026</w:t>
+              <w:t xml:space="preserve">   SETIEMBRE - 2026</w:t>
             </w:r>
           </w:p>
         </w:tc>
@@ -2006,7 +2006,7 @@
                 <w:color w:val="7B1E2B"/>
                 <w:spacing w:val="6"/>
               </w:rPr>
-              <w:t xml:space="preserve">   OCTUBRE - 2026</w:t>
+              <w:t xml:space="preserve">   SETIEMBRE - 2026</w:t>
             </w:r>
           </w:p>
         </w:tc>
@@ -2519,7 +2519,7 @@
                 <w:color w:val="7B1E2B"/>
                 <w:spacing w:val="6"/>
               </w:rPr>
-              <w:t xml:space="preserve">   OCTUBRE - 2026</w:t>
+              <w:t xml:space="preserve">   SETIEMBRE - 2026</w:t>
             </w:r>
           </w:p>
         </w:tc>
@@ -3015,7 +3015,7 @@
                 <w:color w:val="7B1E2B"/>
                 <w:spacing w:val="6"/>
               </w:rPr>
-              <w:t xml:space="preserve">   OCTUBRE - 2026</w:t>
+              <w:t xml:space="preserve">   SETIEMBRE - 2026</w:t>
             </w:r>
           </w:p>
         </w:tc>
@@ -3528,7 +3528,7 @@
                 <w:color w:val="7B1E2B"/>
                 <w:spacing w:val="6"/>
               </w:rPr>
-              <w:t xml:space="preserve">   OCTUBRE - 2026</w:t>
+              <w:t xml:space="preserve">   SETIEMBRE - 2026</w:t>
             </w:r>
           </w:p>
         </w:tc>

</xml_diff>